<commit_message>
HAIL image revision (pc and phone)
</commit_message>
<xml_diff>
--- a/00 memo doc/publications list.docx
+++ b/00 memo doc/publications list.docx
@@ -5,6 +5,37 @@
     <w:p>
       <w:pPr>
         <w:rPr>
+          <w:rFonts w:hint="default" w:ascii="Calibri Bold" w:hAnsi="Calibri Bold" w:cs="Calibri Bold" w:eastAsiaTheme="minorEastAsia"/>
+          <w:b/>
+          <w:bCs/>
+          <w:color w:val="4874CB" w:themeColor="accent1"/>
+          <w:lang w:val="en-US" w:eastAsia="zh-CN"/>
+          <w14:textFill>
+            <w14:solidFill>
+              <w14:schemeClr w14:val="accent1"/>
+            </w14:solidFill>
+          </w14:textFill>
+        </w:rPr>
+      </w:pPr>
+      <w:r>
+        <w:rPr>
+          <w:rFonts w:hint="default" w:ascii="Calibri Bold" w:hAnsi="Calibri Bold" w:cs="Calibri Bold"/>
+          <w:b/>
+          <w:bCs/>
+          <w:color w:val="4874CB" w:themeColor="accent1"/>
+          <w:lang w:val="en-US" w:eastAsia="zh-CN"/>
+          <w14:textFill>
+            <w14:solidFill>
+              <w14:schemeClr w14:val="accent1"/>
+            </w14:solidFill>
+          </w14:textFill>
+        </w:rPr>
+        <w:t>Technologies for Advertising, PR, and Journalism</w:t>
+      </w:r>
+    </w:p>
+    <w:p>
+      <w:pPr>
+        <w:rPr>
           <w:rFonts w:hint="eastAsia"/>
         </w:rPr>
       </w:pPr>
@@ -65,6 +96,37 @@
     <w:p>
       <w:pPr>
         <w:rPr>
+          <w:rFonts w:hint="default" w:ascii="Calibri Bold" w:hAnsi="Calibri Bold" w:cs="Calibri Bold" w:eastAsiaTheme="minorEastAsia"/>
+          <w:b/>
+          <w:bCs/>
+          <w:color w:val="4874CB" w:themeColor="accent1"/>
+          <w:lang w:val="en-US" w:eastAsia="zh-CN"/>
+          <w14:textFill>
+            <w14:solidFill>
+              <w14:schemeClr w14:val="accent1"/>
+            </w14:solidFill>
+          </w14:textFill>
+        </w:rPr>
+      </w:pPr>
+      <w:r>
+        <w:rPr>
+          <w:rFonts w:hint="default" w:ascii="Calibri Bold" w:hAnsi="Calibri Bold" w:cs="Calibri Bold"/>
+          <w:b/>
+          <w:bCs/>
+          <w:color w:val="4874CB" w:themeColor="accent1"/>
+          <w:lang w:val="en-US" w:eastAsia="zh-CN"/>
+          <w14:textFill>
+            <w14:solidFill>
+              <w14:schemeClr w14:val="accent1"/>
+            </w14:solidFill>
+          </w14:textFill>
+        </w:rPr>
+        <w:t>Smartphone and Mobile Technologies</w:t>
+      </w:r>
+    </w:p>
+    <w:p>
+      <w:pPr>
+        <w:rPr>
           <w:rFonts w:hint="eastAsia"/>
         </w:rPr>
       </w:pPr>
@@ -145,6 +207,37 @@
     <w:p>
       <w:pPr>
         <w:rPr>
+          <w:rFonts w:hint="default" w:ascii="Calibri Bold" w:hAnsi="Calibri Bold" w:cs="Calibri Bold" w:eastAsiaTheme="minorEastAsia"/>
+          <w:b/>
+          <w:bCs/>
+          <w:color w:val="4874CB" w:themeColor="accent1"/>
+          <w:lang w:val="en-US" w:eastAsia="zh-CN"/>
+          <w14:textFill>
+            <w14:solidFill>
+              <w14:schemeClr w14:val="accent1"/>
+            </w14:solidFill>
+          </w14:textFill>
+        </w:rPr>
+      </w:pPr>
+      <w:r>
+        <w:rPr>
+          <w:rFonts w:hint="default" w:ascii="Calibri Bold" w:hAnsi="Calibri Bold" w:cs="Calibri Bold"/>
+          <w:b/>
+          <w:bCs/>
+          <w:color w:val="4874CB" w:themeColor="accent1"/>
+          <w:lang w:val="en-US" w:eastAsia="zh-CN"/>
+          <w14:textFill>
+            <w14:solidFill>
+              <w14:schemeClr w14:val="accent1"/>
+            </w14:solidFill>
+          </w14:textFill>
+        </w:rPr>
+        <w:t>HCI Theories, Concepts and Philosophy</w:t>
+      </w:r>
+    </w:p>
+    <w:p>
+      <w:pPr>
+        <w:rPr>
           <w:rFonts w:hint="eastAsia"/>
         </w:rPr>
       </w:pPr>
@@ -365,6 +458,37 @@
     <w:p>
       <w:pPr>
         <w:rPr>
+          <w:rFonts w:hint="default" w:ascii="Calibri Bold" w:hAnsi="Calibri Bold" w:cs="Calibri Bold" w:eastAsiaTheme="minorEastAsia"/>
+          <w:b/>
+          <w:bCs/>
+          <w:color w:val="4874CB" w:themeColor="accent1"/>
+          <w:lang w:val="en-US" w:eastAsia="zh-CN"/>
+          <w14:textFill>
+            <w14:solidFill>
+              <w14:schemeClr w14:val="accent1"/>
+            </w14:solidFill>
+          </w14:textFill>
+        </w:rPr>
+      </w:pPr>
+      <w:r>
+        <w:rPr>
+          <w:rFonts w:hint="default" w:ascii="Calibri Bold" w:hAnsi="Calibri Bold" w:cs="Calibri Bold"/>
+          <w:b/>
+          <w:bCs/>
+          <w:color w:val="4874CB" w:themeColor="accent1"/>
+          <w:lang w:val="en-US" w:eastAsia="zh-CN"/>
+          <w14:textFill>
+            <w14:solidFill>
+              <w14:schemeClr w14:val="accent1"/>
+            </w14:solidFill>
+          </w14:textFill>
+        </w:rPr>
+        <w:t>Speech User Interface</w:t>
+      </w:r>
+    </w:p>
+    <w:p>
+      <w:pPr>
+        <w:rPr>
           <w:rFonts w:hint="eastAsia"/>
         </w:rPr>
       </w:pPr>
@@ -605,6 +729,67 @@
     <w:p>
       <w:pPr>
         <w:rPr>
+          <w:rFonts w:hint="default" w:ascii="Calibri Bold" w:hAnsi="Calibri Bold" w:cs="Calibri Bold" w:eastAsiaTheme="minorEastAsia"/>
+          <w:b/>
+          <w:bCs/>
+          <w:color w:val="4874CB" w:themeColor="accent1"/>
+          <w:lang w:val="en-US" w:eastAsia="zh-CN"/>
+          <w14:textFill>
+            <w14:solidFill>
+              <w14:schemeClr w14:val="accent1"/>
+            </w14:solidFill>
+          </w14:textFill>
+        </w:rPr>
+      </w:pPr>
+      <w:r>
+        <w:rPr>
+          <w:rFonts w:hint="default" w:ascii="Calibri Bold" w:hAnsi="Calibri Bold" w:cs="Calibri Bold"/>
+          <w:b/>
+          <w:bCs/>
+          <w:color w:val="4874CB" w:themeColor="accent1"/>
+          <w:lang w:val="en-US" w:eastAsia="zh-CN"/>
+          <w14:textFill>
+            <w14:solidFill>
+              <w14:schemeClr w14:val="accent1"/>
+            </w14:solidFill>
+          </w14:textFill>
+        </w:rPr>
+        <w:t>Social Media and</w:t>
+      </w:r>
+      <w:r>
+        <w:rPr>
+          <w:rFonts w:hint="eastAsia" w:ascii="Calibri Bold" w:hAnsi="Calibri Bold" w:cs="Calibri Bold"/>
+          <w:b/>
+          <w:bCs/>
+          <w:color w:val="4874CB" w:themeColor="accent1"/>
+          <w:lang w:val="en-US" w:eastAsia="zh-CN"/>
+          <w14:textFill>
+            <w14:solidFill>
+              <w14:schemeClr w14:val="accent1"/>
+            </w14:solidFill>
+          </w14:textFill>
+        </w:rPr>
+        <w:t xml:space="preserve"> </w:t>
+      </w:r>
+      <w:r>
+        <w:rPr>
+          <w:rFonts w:hint="default" w:ascii="Calibri Bold" w:hAnsi="Calibri Bold" w:cs="Calibri Bold"/>
+          <w:b/>
+          <w:bCs/>
+          <w:color w:val="4874CB" w:themeColor="accent1"/>
+          <w:lang w:val="en-US" w:eastAsia="zh-CN"/>
+          <w14:textFill>
+            <w14:solidFill>
+              <w14:schemeClr w14:val="accent1"/>
+            </w14:solidFill>
+          </w14:textFill>
+        </w:rPr>
+        <w:t>Internet</w:t>
+      </w:r>
+    </w:p>
+    <w:p>
+      <w:pPr>
+        <w:rPr>
           <w:rFonts w:hint="eastAsia"/>
         </w:rPr>
       </w:pPr>
@@ -718,9 +903,33 @@
     <w:p>
       <w:pPr>
         <w:rPr>
-          <w:rFonts w:hint="eastAsia"/>
-        </w:rPr>
-      </w:pPr>
+          <w:rFonts w:hint="default" w:ascii="Calibri Bold" w:hAnsi="Calibri Bold" w:cs="Calibri Bold" w:eastAsiaTheme="minorEastAsia"/>
+          <w:b/>
+          <w:bCs/>
+          <w:color w:val="4874CB" w:themeColor="accent1"/>
+          <w:lang w:val="en-US" w:eastAsia="zh-CN"/>
+          <w14:textFill>
+            <w14:solidFill>
+              <w14:schemeClr w14:val="accent1"/>
+            </w14:solidFill>
+          </w14:textFill>
+        </w:rPr>
+      </w:pPr>
+      <w:r>
+        <w:rPr>
+          <w:rFonts w:hint="default" w:ascii="Calibri Bold" w:hAnsi="Calibri Bold" w:cs="Calibri Bold"/>
+          <w:b/>
+          <w:bCs/>
+          <w:color w:val="4874CB" w:themeColor="accent1"/>
+          <w:lang w:val="en-US" w:eastAsia="zh-CN"/>
+          <w14:textFill>
+            <w14:solidFill>
+              <w14:schemeClr w14:val="accent1"/>
+            </w14:solidFill>
+          </w14:textFill>
+        </w:rPr>
+        <w:t>Healthcare Technology</w:t>
+      </w:r>
     </w:p>
     <w:p>
       <w:pPr>
@@ -765,6 +974,37 @@
     <w:p>
       <w:pPr>
         <w:rPr>
+          <w:rFonts w:hint="default" w:ascii="Calibri Bold" w:hAnsi="Calibri Bold" w:cs="Calibri Bold" w:eastAsiaTheme="minorEastAsia"/>
+          <w:b/>
+          <w:bCs/>
+          <w:color w:val="4874CB" w:themeColor="accent1"/>
+          <w:lang w:val="en-US" w:eastAsia="zh-CN"/>
+          <w14:textFill>
+            <w14:solidFill>
+              <w14:schemeClr w14:val="accent1"/>
+            </w14:solidFill>
+          </w14:textFill>
+        </w:rPr>
+      </w:pPr>
+      <w:r>
+        <w:rPr>
+          <w:rFonts w:hint="default" w:ascii="Calibri Bold" w:hAnsi="Calibri Bold" w:cs="Calibri Bold"/>
+          <w:b/>
+          <w:bCs/>
+          <w:color w:val="4874CB" w:themeColor="accent1"/>
+          <w:lang w:val="en-US" w:eastAsia="zh-CN"/>
+          <w14:textFill>
+            <w14:solidFill>
+              <w14:schemeClr w14:val="accent1"/>
+            </w14:solidFill>
+          </w14:textFill>
+        </w:rPr>
+        <w:t>Human Robot Interaction</w:t>
+      </w:r>
+    </w:p>
+    <w:p>
+      <w:pPr>
+        <w:rPr>
           <w:rFonts w:hint="eastAsia"/>
         </w:rPr>
       </w:pPr>
@@ -825,6 +1065,37 @@
     <w:p>
       <w:pPr>
         <w:rPr>
+          <w:rFonts w:hint="default" w:ascii="Calibri Bold" w:hAnsi="Calibri Bold" w:cs="Calibri Bold" w:eastAsiaTheme="minorEastAsia"/>
+          <w:b/>
+          <w:bCs/>
+          <w:color w:val="4874CB" w:themeColor="accent1"/>
+          <w:lang w:val="en-US" w:eastAsia="zh-CN"/>
+          <w14:textFill>
+            <w14:solidFill>
+              <w14:schemeClr w14:val="accent1"/>
+            </w14:solidFill>
+          </w14:textFill>
+        </w:rPr>
+      </w:pPr>
+      <w:r>
+        <w:rPr>
+          <w:rFonts w:hint="default" w:ascii="Calibri Bold" w:hAnsi="Calibri Bold" w:cs="Calibri Bold"/>
+          <w:b/>
+          <w:bCs/>
+          <w:color w:val="4874CB" w:themeColor="accent1"/>
+          <w:lang w:val="en-US" w:eastAsia="zh-CN"/>
+          <w14:textFill>
+            <w14:solidFill>
+              <w14:schemeClr w14:val="accent1"/>
+            </w14:solidFill>
+          </w14:textFill>
+        </w:rPr>
+        <w:t>Educational Technology</w:t>
+      </w:r>
+    </w:p>
+    <w:p>
+      <w:pPr>
+        <w:rPr>
           <w:rFonts w:hint="eastAsia"/>
         </w:rPr>
       </w:pPr>
@@ -892,15 +1163,59 @@
         <w:rPr>
           <w:rFonts w:hint="eastAsia"/>
         </w:rPr>
-        <w:t>Lee, K. M., Liao, K., &amp; Ryu, S. (2007). Children’s learning through computer-synthesized speech: Gender-consistency and gender-similarity effects.Human Communication Research, 22, 310-329.</w:t>
-      </w:r>
-    </w:p>
-    <w:p>
-      <w:pPr>
-        <w:rPr>
-          <w:rFonts w:hint="eastAsia"/>
-        </w:rPr>
-      </w:pPr>
+        <w:t>Lee, K. M., Liao, K., &amp; Ryu, S. (2007). Children</w:t>
+      </w:r>
+      <w:r>
+        <w:rPr>
+          <w:rFonts w:hint="default"/>
+          <w:lang w:val="en-US" w:eastAsia="zh-CN"/>
+        </w:rPr>
+        <w:t>’</w:t>
+      </w:r>
+      <w:r>
+        <w:rPr>
+          <w:rFonts w:hint="eastAsia"/>
+        </w:rPr>
+        <w:t>s learning through computer-synthesized speech: Gender-consistency and gender-similarity effects.Human Communication Research, 22, 310-329.</w:t>
+      </w:r>
+    </w:p>
+    <w:p>
+      <w:pPr>
+        <w:rPr>
+          <w:rFonts w:hint="eastAsia"/>
+        </w:rPr>
+      </w:pPr>
+    </w:p>
+    <w:p>
+      <w:pPr>
+        <w:rPr>
+          <w:rFonts w:hint="default" w:ascii="Calibri Bold" w:hAnsi="Calibri Bold" w:cs="Calibri Bold" w:eastAsiaTheme="minorEastAsia"/>
+          <w:b/>
+          <w:bCs/>
+          <w:color w:val="4874CB" w:themeColor="accent1"/>
+          <w:lang w:val="en-US" w:eastAsia="zh-CN"/>
+          <w14:textFill>
+            <w14:solidFill>
+              <w14:schemeClr w14:val="accent1"/>
+            </w14:solidFill>
+          </w14:textFill>
+        </w:rPr>
+      </w:pPr>
+      <w:r>
+        <w:rPr>
+          <w:rFonts w:hint="default" w:ascii="Calibri Bold" w:hAnsi="Calibri Bold" w:cs="Calibri Bold"/>
+          <w:b/>
+          <w:bCs/>
+          <w:color w:val="4874CB" w:themeColor="accent1"/>
+          <w:lang w:val="en-US" w:eastAsia="zh-CN"/>
+          <w14:textFill>
+            <w14:solidFill>
+              <w14:schemeClr w14:val="accent1"/>
+            </w14:solidFill>
+          </w14:textFill>
+        </w:rPr>
+        <w:t>Technology Policy and Public Intervention</w:t>
+      </w:r>
     </w:p>
     <w:p>
       <w:pPr>
@@ -938,9 +1253,33 @@
     <w:p>
       <w:pPr>
         <w:rPr>
-          <w:rFonts w:hint="eastAsia"/>
-        </w:rPr>
-      </w:pPr>
+          <w:rFonts w:hint="default" w:ascii="Calibri Bold" w:hAnsi="Calibri Bold" w:cs="Calibri Bold" w:eastAsiaTheme="minorEastAsia"/>
+          <w:b/>
+          <w:bCs/>
+          <w:color w:val="4874CB" w:themeColor="accent1"/>
+          <w:lang w:val="en-US" w:eastAsia="zh-CN"/>
+          <w14:textFill>
+            <w14:solidFill>
+              <w14:schemeClr w14:val="accent1"/>
+            </w14:solidFill>
+          </w14:textFill>
+        </w:rPr>
+      </w:pPr>
+      <w:r>
+        <w:rPr>
+          <w:rFonts w:hint="default" w:ascii="Calibri Bold" w:hAnsi="Calibri Bold" w:cs="Calibri Bold"/>
+          <w:b/>
+          <w:bCs/>
+          <w:color w:val="4874CB" w:themeColor="accent1"/>
+          <w:lang w:val="en-US" w:eastAsia="zh-CN"/>
+          <w14:textFill>
+            <w14:solidFill>
+              <w14:schemeClr w14:val="accent1"/>
+            </w14:solidFill>
+          </w14:textFill>
+        </w:rPr>
+        <w:t>Computer Games and Entertainment Technologies</w:t>
+      </w:r>
     </w:p>
     <w:p>
       <w:pPr>
@@ -1245,9 +1584,42 @@
     <w:p>
       <w:pPr>
         <w:rPr>
-          <w:rFonts w:hint="eastAsia"/>
-        </w:rPr>
-      </w:pPr>
+          <w:rFonts w:hint="eastAsia" w:ascii="Calibri Bold" w:hAnsi="Calibri Bold" w:cs="Calibri Bold"/>
+          <w:b/>
+          <w:bCs/>
+          <w:color w:val="4874CB" w:themeColor="accent1"/>
+          <w:lang w:val="en-US" w:eastAsia="zh-CN"/>
+          <w14:textFill>
+            <w14:solidFill>
+              <w14:schemeClr w14:val="accent1"/>
+            </w14:solidFill>
+          </w14:textFill>
+        </w:rPr>
+      </w:pPr>
+      <w:r>
+        <w:rPr>
+          <w:rFonts w:hint="eastAsia" w:ascii="Calibri Bold" w:hAnsi="Calibri Bold" w:cs="Calibri Bold"/>
+          <w:b/>
+          <w:bCs/>
+          <w:color w:val="4874CB" w:themeColor="accent1"/>
+          <w:lang w:val="en-US" w:eastAsia="zh-CN"/>
+          <w14:textFill>
+            <w14:solidFill>
+              <w14:schemeClr w14:val="accent1"/>
+            </w14:solidFill>
+          </w14:textFill>
+        </w:rPr>
+        <w:t>Financial Technology</w:t>
+      </w:r>
+    </w:p>
+    <w:p>
+      <w:pPr>
+        <w:rPr>
+          <w:rFonts w:hint="eastAsia"/>
+        </w:rPr>
+      </w:pPr>
+      <w:bookmarkStart w:id="0" w:name="_GoBack"/>
+      <w:bookmarkEnd w:id="0"/>
       <w:r>
         <w:rPr>
           <w:rFonts w:hint="eastAsia"/>
@@ -2738,8 +3110,6 @@
         </w:rPr>
         <w:t>The present study examined two common mechanisms that are used to explain why reading on an electronic screen versus paper result in different reading outcomes: The Cognitive Map Mechanism and the Medium Materiality Mechanism. A laboratory experiment (N = 45), was conducted using a three-group comparison design (paper book vs. digital equivalent vs. digital disrupted view). Our hypotheses that were based on the cognitive map mechanism were largely supported. On the other hand, our hypotheses following the medium materiality mechanism were not sufficiently evidenced. Specifically, our results showed that the paper book was similar to its digital equivalent, and both were better than the digital disrupted view in terms of reading comprehension, feelings of fatigue, and psychological immersion. The findings implied that it is not the materiality of the presentation medium that influences reading outcomes, rather it is the extent to which the text presentation facilitates, or impedes, the reader's ability to construct a cognitive map that influences the reading process. Implications for future research and practice are discussed.</w:t>
       </w:r>
-      <w:bookmarkStart w:id="0" w:name="_GoBack"/>
-      <w:bookmarkEnd w:id="0"/>
     </w:p>
     <w:p>
       <w:pPr>

</xml_diff>